<commit_message>
Fix Garmin sync transformers - all data types working
</commit_message>
<xml_diff>
--- a/docs/references/Trainelo - Architecture.docx
+++ b/docs/references/Trainelo - Architecture.docx
@@ -1788,6 +1788,183 @@
           <w:lang w:val="en-US"/>
         </w:rPr>
         <w:t>- queues/DLQ, replay/backfills, multi-source conflict resolution, deeper observability</w:t>
+      </w:r>
+    </w:p>
+    <w:p>
+      <w:pPr>
+        <w:rPr>
+          <w:lang w:val="en-US"/>
+        </w:rPr>
+      </w:pPr>
+    </w:p>
+    <w:p>
+      <w:pPr>
+        <w:rPr>
+          <w:lang w:val="en-US"/>
+        </w:rPr>
+      </w:pPr>
+    </w:p>
+    <w:p>
+      <w:pPr>
+        <w:rPr>
+          <w:lang w:val="en-US"/>
+        </w:rPr>
+      </w:pPr>
+      <w:r>
+        <w:rPr>
+          <w:lang w:val="en-US"/>
+        </w:rPr>
+        <w:t>Implementation notes (current repo)</w:t>
+      </w:r>
+    </w:p>
+    <w:p>
+      <w:pPr>
+        <w:rPr>
+          <w:lang w:val="en-US"/>
+        </w:rPr>
+      </w:pPr>
+      <w:r>
+        <w:rPr>
+          <w:lang w:val="en-US"/>
+        </w:rPr>
+        <w:t>- Frontend is a Vite React SPA (React Router).</w:t>
+      </w:r>
+    </w:p>
+    <w:p>
+      <w:pPr>
+        <w:rPr>
+          <w:lang w:val="en-US"/>
+        </w:rPr>
+      </w:pPr>
+      <w:r>
+        <w:rPr>
+          <w:lang w:val="en-US"/>
+        </w:rPr>
+        <w:t xml:space="preserve">- Backend integration edge is </w:t>
+      </w:r>
+      <w:proofErr w:type="spellStart"/>
+      <w:r>
+        <w:rPr>
+          <w:lang w:val="en-US"/>
+        </w:rPr>
+        <w:t>Vercel</w:t>
+      </w:r>
+      <w:proofErr w:type="spellEnd"/>
+      <w:r>
+        <w:rPr>
+          <w:lang w:val="en-US"/>
+        </w:rPr>
+        <w:t xml:space="preserve"> serverless functions under `</w:t>
+      </w:r>
+      <w:proofErr w:type="spellStart"/>
+      <w:r>
+        <w:rPr>
+          <w:lang w:val="en-US"/>
+        </w:rPr>
+        <w:t>api</w:t>
+      </w:r>
+      <w:proofErr w:type="spellEnd"/>
+      <w:r>
+        <w:rPr>
+          <w:lang w:val="en-US"/>
+        </w:rPr>
+        <w:t>/**`.</w:t>
+      </w:r>
+    </w:p>
+    <w:p>
+      <w:pPr>
+        <w:rPr>
+          <w:lang w:val="en-US"/>
+        </w:rPr>
+      </w:pPr>
+      <w:r>
+        <w:rPr>
+          <w:lang w:val="en-US"/>
+        </w:rPr>
+        <w:t>- Windows local dev: run `</w:t>
+      </w:r>
+      <w:proofErr w:type="spellStart"/>
+      <w:r>
+        <w:rPr>
+          <w:lang w:val="en-US"/>
+        </w:rPr>
+        <w:t>npm</w:t>
+      </w:r>
+      <w:proofErr w:type="spellEnd"/>
+      <w:r>
+        <w:rPr>
+          <w:lang w:val="en-US"/>
+        </w:rPr>
+        <w:t xml:space="preserve"> run </w:t>
+      </w:r>
+      <w:proofErr w:type="spellStart"/>
+      <w:r>
+        <w:rPr>
+          <w:lang w:val="en-US"/>
+        </w:rPr>
+        <w:t>dev:full</w:t>
+      </w:r>
+      <w:proofErr w:type="spellEnd"/>
+      <w:r>
+        <w:rPr>
+          <w:lang w:val="en-US"/>
+        </w:rPr>
+        <w:t>` (Vite on :8080 + local Express wrapper for `/</w:t>
+      </w:r>
+      <w:proofErr w:type="spellStart"/>
+      <w:r>
+        <w:rPr>
+          <w:lang w:val="en-US"/>
+        </w:rPr>
+        <w:t>api</w:t>
+      </w:r>
+      <w:proofErr w:type="spellEnd"/>
+      <w:r>
+        <w:rPr>
+          <w:lang w:val="en-US"/>
+        </w:rPr>
+        <w:t>/**` on :3001). Avoid `</w:t>
+      </w:r>
+      <w:proofErr w:type="spellStart"/>
+      <w:r>
+        <w:rPr>
+          <w:lang w:val="en-US"/>
+        </w:rPr>
+        <w:t>vercel</w:t>
+      </w:r>
+      <w:proofErr w:type="spellEnd"/>
+      <w:r>
+        <w:rPr>
+          <w:lang w:val="en-US"/>
+        </w:rPr>
+        <w:t xml:space="preserve"> dev` due to MIME type issues with Vite modules.</w:t>
+      </w:r>
+    </w:p>
+    <w:p>
+      <w:pPr>
+        <w:rPr>
+          <w:lang w:val="en-US"/>
+        </w:rPr>
+      </w:pPr>
+      <w:r>
+        <w:rPr>
+          <w:lang w:val="en-US"/>
+        </w:rPr>
+        <w:t xml:space="preserve">- Raw vendor payloads should be written to </w:t>
+      </w:r>
+      <w:proofErr w:type="spellStart"/>
+      <w:r>
+        <w:rPr>
+          <w:lang w:val="en-US"/>
+        </w:rPr>
+        <w:t>Supabase</w:t>
+      </w:r>
+      <w:proofErr w:type="spellEnd"/>
+      <w:r>
+        <w:rPr>
+          <w:lang w:val="en-US"/>
+        </w:rPr>
+        <w:t xml:space="preserve"> Storage (e.g. bucket `raw-payloads`) before parsing (tolerant parsing).</w:t>
       </w:r>
     </w:p>
     <w:p>
@@ -2205,6 +2382,7 @@
   <w:style w:type="paragraph" w:default="1" w:styleId="Normal">
     <w:name w:val="Normal"/>
     <w:qFormat/>
+    <w:rsid w:val="00D42293"/>
   </w:style>
   <w:style w:type="paragraph" w:styleId="Heading1">
     <w:name w:val="heading 1"/>
@@ -2408,6 +2586,7 @@
   <w:style w:type="character" w:default="1" w:styleId="DefaultParagraphFont">
     <w:name w:val="Default Paragraph Font"/>
     <w:uiPriority w:val="1"/>
+    <w:semiHidden/>
     <w:unhideWhenUsed/>
   </w:style>
   <w:style w:type="table" w:default="1" w:styleId="TableNormal">

</xml_diff>